<commit_message>
Ajout requirements.txt + annexe Hypotheses (Mission 1 complete)
</commit_message>
<xml_diff>
--- a/docs/documentation_projet13_bottleneck.docx
+++ b/docs/documentation_projet13_bottleneck.docx
@@ -427,12 +427,6 @@
         <w:gridCol w:w="3600"/>
       </w:tblGrid>
       <w:tr>
-        <w:tblPrEx>
-          <w:tblCellMar>
-            <w:top w:w="0" w:type="dxa"/>
-            <w:bottom w:w="0" w:type="dxa"/>
-          </w:tblCellMar>
-        </w:tblPrEx>
         <w:tc>
           <w:tcPr>
             <w:tcW w:w="2600" w:type="dxa"/>
@@ -509,12 +503,6 @@
         </w:tc>
       </w:tr>
       <w:tr>
-        <w:tblPrEx>
-          <w:tblCellMar>
-            <w:top w:w="0" w:type="dxa"/>
-            <w:bottom w:w="0" w:type="dxa"/>
-          </w:tblCellMar>
-        </w:tblPrEx>
         <w:tc>
           <w:tcPr>
             <w:tcW w:w="2600" w:type="dxa"/>
@@ -580,12 +568,6 @@
         </w:tc>
       </w:tr>
       <w:tr>
-        <w:tblPrEx>
-          <w:tblCellMar>
-            <w:top w:w="0" w:type="dxa"/>
-            <w:bottom w:w="0" w:type="dxa"/>
-          </w:tblCellMar>
-        </w:tblPrEx>
         <w:tc>
           <w:tcPr>
             <w:tcW w:w="2600" w:type="dxa"/>
@@ -651,12 +633,6 @@
         </w:tc>
       </w:tr>
       <w:tr>
-        <w:tblPrEx>
-          <w:tblCellMar>
-            <w:top w:w="0" w:type="dxa"/>
-            <w:bottom w:w="0" w:type="dxa"/>
-          </w:tblCellMar>
-        </w:tblPrEx>
         <w:tc>
           <w:tcPr>
             <w:tcW w:w="2600" w:type="dxa"/>
@@ -732,12 +708,6 @@
         </w:tc>
       </w:tr>
       <w:tr>
-        <w:tblPrEx>
-          <w:tblCellMar>
-            <w:top w:w="0" w:type="dxa"/>
-            <w:bottom w:w="0" w:type="dxa"/>
-          </w:tblCellMar>
-        </w:tblPrEx>
         <w:tc>
           <w:tcPr>
             <w:tcW w:w="2600" w:type="dxa"/>
@@ -803,12 +773,6 @@
         </w:tc>
       </w:tr>
       <w:tr>
-        <w:tblPrEx>
-          <w:tblCellMar>
-            <w:top w:w="0" w:type="dxa"/>
-            <w:bottom w:w="0" w:type="dxa"/>
-          </w:tblCellMar>
-        </w:tblPrEx>
         <w:tc>
           <w:tcPr>
             <w:tcW w:w="2600" w:type="dxa"/>
@@ -874,12 +838,6 @@
         </w:tc>
       </w:tr>
       <w:tr>
-        <w:tblPrEx>
-          <w:tblCellMar>
-            <w:top w:w="0" w:type="dxa"/>
-            <w:bottom w:w="0" w:type="dxa"/>
-          </w:tblCellMar>
-        </w:tblPrEx>
         <w:tc>
           <w:tcPr>
             <w:tcW w:w="2600" w:type="dxa"/>
@@ -1009,12 +967,6 @@
         <w:gridCol w:w="3800"/>
       </w:tblGrid>
       <w:tr>
-        <w:tblPrEx>
-          <w:tblCellMar>
-            <w:top w:w="0" w:type="dxa"/>
-            <w:bottom w:w="0" w:type="dxa"/>
-          </w:tblCellMar>
-        </w:tblPrEx>
         <w:tc>
           <w:tcPr>
             <w:tcW w:w="2200" w:type="dxa"/>
@@ -1089,12 +1041,6 @@
         </w:tc>
       </w:tr>
       <w:tr>
-        <w:tblPrEx>
-          <w:tblCellMar>
-            <w:top w:w="0" w:type="dxa"/>
-            <w:bottom w:w="0" w:type="dxa"/>
-          </w:tblCellMar>
-        </w:tblPrEx>
         <w:tc>
           <w:tcPr>
             <w:tcW w:w="2200" w:type="dxa"/>
@@ -1160,12 +1106,6 @@
         </w:tc>
       </w:tr>
       <w:tr>
-        <w:tblPrEx>
-          <w:tblCellMar>
-            <w:top w:w="0" w:type="dxa"/>
-            <w:bottom w:w="0" w:type="dxa"/>
-          </w:tblCellMar>
-        </w:tblPrEx>
         <w:tc>
           <w:tcPr>
             <w:tcW w:w="2200" w:type="dxa"/>
@@ -1231,12 +1171,6 @@
         </w:tc>
       </w:tr>
       <w:tr>
-        <w:tblPrEx>
-          <w:tblCellMar>
-            <w:top w:w="0" w:type="dxa"/>
-            <w:bottom w:w="0" w:type="dxa"/>
-          </w:tblCellMar>
-        </w:tblPrEx>
         <w:tc>
           <w:tcPr>
             <w:tcW w:w="2200" w:type="dxa"/>
@@ -1630,12 +1564,6 @@
         <w:gridCol w:w="3400"/>
       </w:tblGrid>
       <w:tr>
-        <w:tblPrEx>
-          <w:tblCellMar>
-            <w:top w:w="0" w:type="dxa"/>
-            <w:bottom w:w="0" w:type="dxa"/>
-          </w:tblCellMar>
-        </w:tblPrEx>
         <w:tc>
           <w:tcPr>
             <w:tcW w:w="2000" w:type="dxa"/>
@@ -1710,12 +1638,6 @@
         </w:tc>
       </w:tr>
       <w:tr>
-        <w:tblPrEx>
-          <w:tblCellMar>
-            <w:top w:w="0" w:type="dxa"/>
-            <w:bottom w:w="0" w:type="dxa"/>
-          </w:tblCellMar>
-        </w:tblPrEx>
         <w:tc>
           <w:tcPr>
             <w:tcW w:w="2000" w:type="dxa"/>
@@ -1781,12 +1703,6 @@
         </w:tc>
       </w:tr>
       <w:tr>
-        <w:tblPrEx>
-          <w:tblCellMar>
-            <w:top w:w="0" w:type="dxa"/>
-            <w:bottom w:w="0" w:type="dxa"/>
-          </w:tblCellMar>
-        </w:tblPrEx>
         <w:tc>
           <w:tcPr>
             <w:tcW w:w="2000" w:type="dxa"/>
@@ -1852,12 +1768,6 @@
         </w:tc>
       </w:tr>
       <w:tr>
-        <w:tblPrEx>
-          <w:tblCellMar>
-            <w:top w:w="0" w:type="dxa"/>
-            <w:bottom w:w="0" w:type="dxa"/>
-          </w:tblCellMar>
-        </w:tblPrEx>
         <w:tc>
           <w:tcPr>
             <w:tcW w:w="2000" w:type="dxa"/>
@@ -1941,12 +1851,6 @@
         </w:tc>
       </w:tr>
       <w:tr>
-        <w:tblPrEx>
-          <w:tblCellMar>
-            <w:top w:w="0" w:type="dxa"/>
-            <w:bottom w:w="0" w:type="dxa"/>
-          </w:tblCellMar>
-        </w:tblPrEx>
         <w:tc>
           <w:tcPr>
             <w:tcW w:w="2000" w:type="dxa"/>
@@ -2012,12 +1916,6 @@
         </w:tc>
       </w:tr>
       <w:tr>
-        <w:tblPrEx>
-          <w:tblCellMar>
-            <w:top w:w="0" w:type="dxa"/>
-            <w:bottom w:w="0" w:type="dxa"/>
-          </w:tblCellMar>
-        </w:tblPrEx>
         <w:tc>
           <w:tcPr>
             <w:tcW w:w="2000" w:type="dxa"/>
@@ -2083,12 +1981,6 @@
         </w:tc>
       </w:tr>
       <w:tr>
-        <w:tblPrEx>
-          <w:tblCellMar>
-            <w:top w:w="0" w:type="dxa"/>
-            <w:bottom w:w="0" w:type="dxa"/>
-          </w:tblCellMar>
-        </w:tblPrEx>
         <w:tc>
           <w:tcPr>
             <w:tcW w:w="2000" w:type="dxa"/>
@@ -2209,12 +2101,6 @@
         <w:gridCol w:w="2600"/>
       </w:tblGrid>
       <w:tr>
-        <w:tblPrEx>
-          <w:tblCellMar>
-            <w:top w:w="0" w:type="dxa"/>
-            <w:bottom w:w="0" w:type="dxa"/>
-          </w:tblCellMar>
-        </w:tblPrEx>
         <w:tc>
           <w:tcPr>
             <w:tcW w:w="1400" w:type="dxa"/>
@@ -2289,12 +2175,6 @@
         </w:tc>
       </w:tr>
       <w:tr>
-        <w:tblPrEx>
-          <w:tblCellMar>
-            <w:top w:w="0" w:type="dxa"/>
-            <w:bottom w:w="0" w:type="dxa"/>
-          </w:tblCellMar>
-        </w:tblPrEx>
         <w:tc>
           <w:tcPr>
             <w:tcW w:w="1400" w:type="dxa"/>
@@ -2360,12 +2240,6 @@
         </w:tc>
       </w:tr>
       <w:tr>
-        <w:tblPrEx>
-          <w:tblCellMar>
-            <w:top w:w="0" w:type="dxa"/>
-            <w:bottom w:w="0" w:type="dxa"/>
-          </w:tblCellMar>
-        </w:tblPrEx>
         <w:tc>
           <w:tcPr>
             <w:tcW w:w="1400" w:type="dxa"/>
@@ -2431,12 +2305,6 @@
         </w:tc>
       </w:tr>
       <w:tr>
-        <w:tblPrEx>
-          <w:tblCellMar>
-            <w:top w:w="0" w:type="dxa"/>
-            <w:bottom w:w="0" w:type="dxa"/>
-          </w:tblCellMar>
-        </w:tblPrEx>
         <w:tc>
           <w:tcPr>
             <w:tcW w:w="1400" w:type="dxa"/>
@@ -2503,12 +2371,6 @@
         </w:tc>
       </w:tr>
       <w:tr>
-        <w:tblPrEx>
-          <w:tblCellMar>
-            <w:top w:w="0" w:type="dxa"/>
-            <w:bottom w:w="0" w:type="dxa"/>
-          </w:tblCellMar>
-        </w:tblPrEx>
         <w:tc>
           <w:tcPr>
             <w:tcW w:w="1400" w:type="dxa"/>
@@ -2574,12 +2436,6 @@
         </w:tc>
       </w:tr>
       <w:tr>
-        <w:tblPrEx>
-          <w:tblCellMar>
-            <w:top w:w="0" w:type="dxa"/>
-            <w:bottom w:w="0" w:type="dxa"/>
-          </w:tblCellMar>
-        </w:tblPrEx>
         <w:tc>
           <w:tcPr>
             <w:tcW w:w="1400" w:type="dxa"/>
@@ -2663,12 +2519,6 @@
         </w:tc>
       </w:tr>
       <w:tr>
-        <w:tblPrEx>
-          <w:tblCellMar>
-            <w:top w:w="0" w:type="dxa"/>
-            <w:bottom w:w="0" w:type="dxa"/>
-          </w:tblCellMar>
-        </w:tblPrEx>
         <w:tc>
           <w:tcPr>
             <w:tcW w:w="1400" w:type="dxa"/>
@@ -2734,12 +2584,6 @@
         </w:tc>
       </w:tr>
       <w:tr>
-        <w:tblPrEx>
-          <w:tblCellMar>
-            <w:top w:w="0" w:type="dxa"/>
-            <w:bottom w:w="0" w:type="dxa"/>
-          </w:tblCellMar>
-        </w:tblPrEx>
         <w:tc>
           <w:tcPr>
             <w:tcW w:w="1400" w:type="dxa"/>
@@ -3000,12 +2844,6 @@
         <w:gridCol w:w="3200"/>
       </w:tblGrid>
       <w:tr>
-        <w:tblPrEx>
-          <w:tblCellMar>
-            <w:top w:w="0" w:type="dxa"/>
-            <w:bottom w:w="0" w:type="dxa"/>
-          </w:tblCellMar>
-        </w:tblPrEx>
         <w:tc>
           <w:tcPr>
             <w:tcW w:w="3200" w:type="dxa"/>
@@ -3104,12 +2942,6 @@
         </w:tc>
       </w:tr>
       <w:tr>
-        <w:tblPrEx>
-          <w:tblCellMar>
-            <w:top w:w="0" w:type="dxa"/>
-            <w:bottom w:w="0" w:type="dxa"/>
-          </w:tblCellMar>
-        </w:tblPrEx>
         <w:tc>
           <w:tcPr>
             <w:tcW w:w="3200" w:type="dxa"/>
@@ -3206,12 +3038,6 @@
         </w:tc>
       </w:tr>
       <w:tr>
-        <w:tblPrEx>
-          <w:tblCellMar>
-            <w:top w:w="0" w:type="dxa"/>
-            <w:bottom w:w="0" w:type="dxa"/>
-          </w:tblCellMar>
-        </w:tblPrEx>
         <w:tc>
           <w:tcPr>
             <w:tcW w:w="3200" w:type="dxa"/>
@@ -3298,12 +3124,6 @@
         </w:tc>
       </w:tr>
       <w:tr>
-        <w:tblPrEx>
-          <w:tblCellMar>
-            <w:top w:w="0" w:type="dxa"/>
-            <w:bottom w:w="0" w:type="dxa"/>
-          </w:tblCellMar>
-        </w:tblPrEx>
         <w:tc>
           <w:tcPr>
             <w:tcW w:w="3200" w:type="dxa"/>
@@ -3390,12 +3210,6 @@
         </w:tc>
       </w:tr>
       <w:tr>
-        <w:tblPrEx>
-          <w:tblCellMar>
-            <w:top w:w="0" w:type="dxa"/>
-            <w:bottom w:w="0" w:type="dxa"/>
-          </w:tblCellMar>
-        </w:tblPrEx>
         <w:tc>
           <w:tcPr>
             <w:tcW w:w="3200" w:type="dxa"/>
@@ -3681,6 +3495,571 @@
         <w:gridCol w:w="6600"/>
       </w:tblGrid>
       <w:tr>
+        <w:tc>
+          <w:tcPr>
+            <w:tcW w:w="1800" w:type="dxa"/>
+            <w:shd w:val="clear" w:color="auto" w:fill="E8EEF4"/>
+            <w:tcMar>
+              <w:top w:w="80" w:type="dxa"/>
+              <w:left w:w="100" w:type="dxa"/>
+              <w:bottom w:w="80" w:type="dxa"/>
+              <w:right w:w="100" w:type="dxa"/>
+            </w:tcMar>
+          </w:tcPr>
+          <w:p>
+            <w:r>
+              <w:rPr>
+                <w:b/>
+                <w:bCs/>
+                <w:color w:val="000000"/>
+                <w:sz w:val="20"/>
+                <w:szCs w:val="20"/>
+              </w:rPr>
+              <w:t>Priorité</w:t>
+            </w:r>
+          </w:p>
+        </w:tc>
+        <w:tc>
+          <w:tcPr>
+            <w:tcW w:w="1400" w:type="dxa"/>
+            <w:shd w:val="clear" w:color="auto" w:fill="E8EEF4"/>
+            <w:tcMar>
+              <w:top w:w="80" w:type="dxa"/>
+              <w:left w:w="100" w:type="dxa"/>
+              <w:bottom w:w="80" w:type="dxa"/>
+              <w:right w:w="100" w:type="dxa"/>
+            </w:tcMar>
+          </w:tcPr>
+          <w:p>
+            <w:r>
+              <w:rPr>
+                <w:b/>
+                <w:bCs/>
+                <w:color w:val="000000"/>
+                <w:sz w:val="20"/>
+                <w:szCs w:val="20"/>
+              </w:rPr>
+              <w:t>Nombre</w:t>
+            </w:r>
+          </w:p>
+        </w:tc>
+        <w:tc>
+          <w:tcPr>
+            <w:tcW w:w="6600" w:type="dxa"/>
+            <w:shd w:val="clear" w:color="auto" w:fill="E8EEF4"/>
+            <w:tcMar>
+              <w:top w:w="80" w:type="dxa"/>
+              <w:left w:w="100" w:type="dxa"/>
+              <w:bottom w:w="80" w:type="dxa"/>
+              <w:right w:w="100" w:type="dxa"/>
+            </w:tcMar>
+          </w:tcPr>
+          <w:p>
+            <w:r>
+              <w:rPr>
+                <w:b/>
+                <w:bCs/>
+                <w:color w:val="000000"/>
+                <w:sz w:val="20"/>
+                <w:szCs w:val="20"/>
+              </w:rPr>
+              <w:t>Nature</w:t>
+            </w:r>
+          </w:p>
+        </w:tc>
+      </w:tr>
+      <w:tr>
+        <w:tc>
+          <w:tcPr>
+            <w:tcW w:w="1800" w:type="dxa"/>
+            <w:tcMar>
+              <w:top w:w="80" w:type="dxa"/>
+              <w:left w:w="100" w:type="dxa"/>
+              <w:bottom w:w="80" w:type="dxa"/>
+              <w:right w:w="100" w:type="dxa"/>
+            </w:tcMar>
+          </w:tcPr>
+          <w:p>
+            <w:r>
+              <w:rPr>
+                <w:color w:val="000000"/>
+                <w:sz w:val="20"/>
+                <w:szCs w:val="20"/>
+              </w:rPr>
+              <w:t>Critique</w:t>
+            </w:r>
+          </w:p>
+        </w:tc>
+        <w:tc>
+          <w:tcPr>
+            <w:tcW w:w="1400" w:type="dxa"/>
+            <w:tcMar>
+              <w:top w:w="80" w:type="dxa"/>
+              <w:left w:w="100" w:type="dxa"/>
+              <w:bottom w:w="80" w:type="dxa"/>
+              <w:right w:w="100" w:type="dxa"/>
+            </w:tcMar>
+          </w:tcPr>
+          <w:p>
+            <w:r>
+              <w:rPr>
+                <w:color w:val="000000"/>
+                <w:sz w:val="20"/>
+                <w:szCs w:val="20"/>
+              </w:rPr>
+              <w:t>9</w:t>
+            </w:r>
+          </w:p>
+        </w:tc>
+        <w:tc>
+          <w:tcPr>
+            <w:tcW w:w="6600" w:type="dxa"/>
+            <w:tcMar>
+              <w:top w:w="80" w:type="dxa"/>
+              <w:left w:w="100" w:type="dxa"/>
+              <w:bottom w:w="80" w:type="dxa"/>
+              <w:right w:w="100" w:type="dxa"/>
+            </w:tcMar>
+          </w:tcPr>
+          <w:p>
+            <w:r>
+              <w:rPr>
+                <w:color w:val="000000"/>
+                <w:sz w:val="20"/>
+                <w:szCs w:val="20"/>
+              </w:rPr>
+              <w:t>Prix négatifs, stocks négatifs, marge négative (vente à perte)</w:t>
+            </w:r>
+          </w:p>
+        </w:tc>
+      </w:tr>
+      <w:tr>
+        <w:tc>
+          <w:tcPr>
+            <w:tcW w:w="1800" w:type="dxa"/>
+            <w:tcMar>
+              <w:top w:w="80" w:type="dxa"/>
+              <w:left w:w="100" w:type="dxa"/>
+              <w:bottom w:w="80" w:type="dxa"/>
+              <w:right w:w="100" w:type="dxa"/>
+            </w:tcMar>
+          </w:tcPr>
+          <w:p>
+            <w:r>
+              <w:rPr>
+                <w:color w:val="000000"/>
+                <w:sz w:val="20"/>
+                <w:szCs w:val="20"/>
+              </w:rPr>
+              <w:t>Majeure</w:t>
+            </w:r>
+          </w:p>
+        </w:tc>
+        <w:tc>
+          <w:tcPr>
+            <w:tcW w:w="1400" w:type="dxa"/>
+            <w:tcMar>
+              <w:top w:w="80" w:type="dxa"/>
+              <w:left w:w="100" w:type="dxa"/>
+              <w:bottom w:w="80" w:type="dxa"/>
+              <w:right w:w="100" w:type="dxa"/>
+            </w:tcMar>
+          </w:tcPr>
+          <w:p>
+            <w:r>
+              <w:rPr>
+                <w:color w:val="000000"/>
+                <w:sz w:val="20"/>
+                <w:szCs w:val="20"/>
+              </w:rPr>
+              <w:t>0</w:t>
+            </w:r>
+          </w:p>
+        </w:tc>
+        <w:tc>
+          <w:tcPr>
+            <w:tcW w:w="6600" w:type="dxa"/>
+            <w:tcMar>
+              <w:top w:w="80" w:type="dxa"/>
+              <w:left w:w="100" w:type="dxa"/>
+              <w:bottom w:w="80" w:type="dxa"/>
+              <w:right w:w="100" w:type="dxa"/>
+            </w:tcMar>
+          </w:tcPr>
+          <w:p>
+            <w:r>
+              <w:rPr>
+                <w:color w:val="000000"/>
+                <w:sz w:val="20"/>
+                <w:szCs w:val="20"/>
+              </w:rPr>
+              <w:t xml:space="preserve">Incohérence stock déjà corrigée manuellement dans le P6 — validé par </w:t>
+            </w:r>
+            <w:proofErr w:type="spellStart"/>
+            <w:r>
+              <w:rPr>
+                <w:color w:val="000000"/>
+                <w:sz w:val="20"/>
+                <w:szCs w:val="20"/>
+              </w:rPr>
+              <w:t>Pandera</w:t>
+            </w:r>
+            <w:proofErr w:type="spellEnd"/>
+          </w:p>
+        </w:tc>
+      </w:tr>
+      <w:tr>
+        <w:tc>
+          <w:tcPr>
+            <w:tcW w:w="1800" w:type="dxa"/>
+            <w:tcMar>
+              <w:top w:w="80" w:type="dxa"/>
+              <w:left w:w="100" w:type="dxa"/>
+              <w:bottom w:w="80" w:type="dxa"/>
+              <w:right w:w="100" w:type="dxa"/>
+            </w:tcMar>
+          </w:tcPr>
+          <w:p>
+            <w:r>
+              <w:rPr>
+                <w:color w:val="000000"/>
+                <w:sz w:val="20"/>
+                <w:szCs w:val="20"/>
+              </w:rPr>
+              <w:t>Mineure</w:t>
+            </w:r>
+          </w:p>
+        </w:tc>
+        <w:tc>
+          <w:tcPr>
+            <w:tcW w:w="1400" w:type="dxa"/>
+            <w:tcMar>
+              <w:top w:w="80" w:type="dxa"/>
+              <w:left w:w="100" w:type="dxa"/>
+              <w:bottom w:w="80" w:type="dxa"/>
+              <w:right w:w="100" w:type="dxa"/>
+            </w:tcMar>
+          </w:tcPr>
+          <w:p>
+            <w:r>
+              <w:rPr>
+                <w:color w:val="000000"/>
+                <w:sz w:val="20"/>
+                <w:szCs w:val="20"/>
+              </w:rPr>
+              <w:t>2</w:t>
+            </w:r>
+          </w:p>
+        </w:tc>
+        <w:tc>
+          <w:tcPr>
+            <w:tcW w:w="6600" w:type="dxa"/>
+            <w:tcMar>
+              <w:top w:w="80" w:type="dxa"/>
+              <w:left w:w="100" w:type="dxa"/>
+              <w:bottom w:w="80" w:type="dxa"/>
+              <w:right w:w="100" w:type="dxa"/>
+            </w:tcMar>
+          </w:tcPr>
+          <w:p>
+            <w:r>
+              <w:rPr>
+                <w:color w:val="000000"/>
+                <w:sz w:val="20"/>
+                <w:szCs w:val="20"/>
+              </w:rPr>
+              <w:t xml:space="preserve">Format </w:t>
+            </w:r>
+            <w:proofErr w:type="spellStart"/>
+            <w:r>
+              <w:rPr>
+                <w:color w:val="000000"/>
+                <w:sz w:val="20"/>
+                <w:szCs w:val="20"/>
+              </w:rPr>
+              <w:t>sku</w:t>
+            </w:r>
+            <w:proofErr w:type="spellEnd"/>
+            <w:r>
+              <w:rPr>
+                <w:color w:val="000000"/>
+                <w:sz w:val="20"/>
+                <w:szCs w:val="20"/>
+              </w:rPr>
+              <w:t xml:space="preserve"> non numérique (dont un bon cadeau, pas un vrai produit)</w:t>
+            </w:r>
+          </w:p>
+        </w:tc>
+      </w:tr>
+    </w:tbl>
+    <w:p>
+      <w:pPr>
+        <w:spacing w:after="100"/>
+      </w:pPr>
+    </w:p>
+    <w:p>
+      <w:pPr>
+        <w:spacing w:after="160"/>
+      </w:pPr>
+      <w:r>
+        <w:lastRenderedPageBreak/>
+        <w:t>Point notable : l'absence d'anomalies « Majeure » confirme que la correction manuelle de cohérence stock du P6 original fonctionnait correctement — la validation automatisée ne se contente donc pas de détecter des erreurs, elle valide aussi la fiabilité du travail existant. Par ailleurs, 4 cas de vente à perte ont été détectés sans que le prix soit négatif (prix positif mais inférieur au prix d'achat) — invisibles avec le contrôle initial du P6, qui ne vérifiait que le signe du prix.</w:t>
+      </w:r>
+    </w:p>
+    <w:p>
+      <w:pPr>
+        <w:pStyle w:val="Titre1"/>
+      </w:pPr>
+      <w:r>
+        <w:t>7. Limites et prochaines pistes</w:t>
+      </w:r>
+    </w:p>
+    <w:p>
+      <w:pPr>
+        <w:pStyle w:val="Titre3"/>
+      </w:pPr>
+      <w:r>
+        <w:t>7.1 — Limites assumées</w:t>
+      </w:r>
+    </w:p>
+    <w:p>
+      <w:pPr>
+        <w:pStyle w:val="Paragraphedeliste"/>
+        <w:numPr>
+          <w:ilvl w:val="0"/>
+          <w:numId w:val="1"/>
+        </w:numPr>
+        <w:spacing w:after="80"/>
+      </w:pPr>
+      <w:r>
+        <w:t>Axes détection d'anomalies avancée (Isolation Forest / LOF) et clustering non développés — recentrage du périmètre sur un axe traité en profondeur, cohérent avec un contexte de travail individuel</w:t>
+      </w:r>
+    </w:p>
+    <w:p>
+      <w:pPr>
+        <w:pStyle w:val="Paragraphedeliste"/>
+        <w:numPr>
+          <w:ilvl w:val="0"/>
+          <w:numId w:val="1"/>
+        </w:numPr>
+        <w:spacing w:after="80"/>
+      </w:pPr>
+      <w:r>
+        <w:t>L'outil détecte les anomalies mais ne les corrige pas automatiquement — la décision de correction reste humaine, volontairement</w:t>
+      </w:r>
+    </w:p>
+    <w:p>
+      <w:pPr>
+        <w:pStyle w:val="Paragraphedeliste"/>
+        <w:numPr>
+          <w:ilvl w:val="0"/>
+          <w:numId w:val="1"/>
+        </w:numPr>
+        <w:spacing w:after="80"/>
+      </w:pPr>
+      <w:r>
+        <w:t>Pas de dimension temporelle exploitée (photo du catalogue à un instant T)</w:t>
+      </w:r>
+    </w:p>
+    <w:p>
+      <w:pPr>
+        <w:pStyle w:val="Titre3"/>
+      </w:pPr>
+      <w:r>
+        <w:t>7.2 — Prochaines pistes</w:t>
+      </w:r>
+    </w:p>
+    <w:p>
+      <w:pPr>
+        <w:pStyle w:val="Paragraphedeliste"/>
+        <w:numPr>
+          <w:ilvl w:val="0"/>
+          <w:numId w:val="1"/>
+        </w:numPr>
+        <w:spacing w:after="80"/>
+      </w:pPr>
+      <w:r>
+        <w:t>Clustering du catalogue (K-</w:t>
+      </w:r>
+      <w:proofErr w:type="spellStart"/>
+      <w:r>
+        <w:t>means</w:t>
+      </w:r>
+      <w:proofErr w:type="spellEnd"/>
+      <w:r>
+        <w:t xml:space="preserve"> vs DBSCAN) pour une segmentation marketing</w:t>
+      </w:r>
+    </w:p>
+    <w:p>
+      <w:pPr>
+        <w:pStyle w:val="Paragraphedeliste"/>
+        <w:numPr>
+          <w:ilvl w:val="0"/>
+          <w:numId w:val="1"/>
+        </w:numPr>
+        <w:spacing w:after="80"/>
+      </w:pPr>
+      <w:r>
+        <w:t>Extension du rapport d'anomalies avec un suivi de correction dans le temps (avant / après) — piste à forte valeur ajoutée pour objectiver l'amélioration de la qualité catalogue dans la durée. Effort estimé : 3 à 4h (stockage d'un historique de rapports horodatés + logique de comparaison entre deux exécutions)</w:t>
+      </w:r>
+    </w:p>
+    <w:p>
+      <w:pPr>
+        <w:pStyle w:val="Paragraphedeliste"/>
+        <w:numPr>
+          <w:ilvl w:val="0"/>
+          <w:numId w:val="1"/>
+        </w:numPr>
+        <w:spacing w:after="80"/>
+      </w:pPr>
+      <w:r>
+        <w:t xml:space="preserve">Industrialisation légère : exécution automatique du contrôle qualité à chaque nouvel import de fichier source. Dans un contexte professionnel réel, cette étape serait indispensable — mais le choix de la bonne méthode dépend d'informations non disponibles à ce stade (comment les fichiers </w:t>
+      </w:r>
+      <w:proofErr w:type="spellStart"/>
+      <w:r>
+        <w:t>erp</w:t>
+      </w:r>
+      <w:proofErr w:type="spellEnd"/>
+      <w:r>
+        <w:t>/web/liaison sont-ils réellement générés et déposés : export manuel, job planifié, dépôt sur un espace partagé ?). Trois approches possibles, par ordre de complexité croissante :</w:t>
+      </w:r>
+    </w:p>
+    <w:p>
+      <w:pPr>
+        <w:pStyle w:val="Paragraphedeliste"/>
+        <w:numPr>
+          <w:ilvl w:val="1"/>
+          <w:numId w:val="1"/>
+        </w:numPr>
+        <w:spacing w:after="100"/>
+      </w:pPr>
+      <w:r>
+        <w:rPr>
+          <w:b/>
+          <w:bCs/>
+        </w:rPr>
+        <w:t xml:space="preserve">Exécution manuelle guidée — </w:t>
+      </w:r>
+      <w:r>
+        <w:t>un script/commande unique à lancer après chaque nouvel export. Le plus simple, ne dépend d'aucune information sur le processus amont, mais demande encore une action humaine pour déclencher. Effort estimé : 1h.</w:t>
+      </w:r>
+    </w:p>
+    <w:p>
+      <w:pPr>
+        <w:pStyle w:val="Paragraphedeliste"/>
+        <w:numPr>
+          <w:ilvl w:val="1"/>
+          <w:numId w:val="1"/>
+        </w:numPr>
+        <w:spacing w:after="100"/>
+      </w:pPr>
+      <w:r>
+        <w:rPr>
+          <w:b/>
+          <w:bCs/>
+        </w:rPr>
+        <w:t xml:space="preserve">Surveillance de dossier (file watcher) — </w:t>
+      </w:r>
+      <w:r>
+        <w:t>un script en tâche de fond qui détecte automatiquement l'arrivée d'un nouveau fichier dans un dossier partagé (réseau, Drive synchronisé) et lance la validation sans intervention. Pertinent si les fichiers sont déposés manuellement mais régulièrement au même endroit. Effort estimé : 2 à 3h.</w:t>
+      </w:r>
+    </w:p>
+    <w:p>
+      <w:pPr>
+        <w:pStyle w:val="Paragraphedeliste"/>
+        <w:numPr>
+          <w:ilvl w:val="1"/>
+          <w:numId w:val="1"/>
+        </w:numPr>
+        <w:spacing w:after="100"/>
+      </w:pPr>
+      <w:r>
+        <w:rPr>
+          <w:b/>
+          <w:bCs/>
+        </w:rPr>
+        <w:t xml:space="preserve">Intégration CI/CD (ex : GitHub Actions) — </w:t>
+      </w:r>
+      <w:r>
+        <w:t>déclenchement automatique de la validation à chaque nouveau dépôt de fichier sur le repo. La plus "industrielle" des trois, mais suppose que les fichiers sources transitent eux-mêmes par un flux versionné — hypothèse à vérifier avec l'IT en contexte professionnel réel. Effort estimé : 4 à 5h.</w:t>
+      </w:r>
+    </w:p>
+    <w:p>
+      <w:pPr>
+        <w:spacing w:after="100"/>
+      </w:pPr>
+    </w:p>
+    <w:p>
+      <w:pPr>
+        <w:spacing w:after="100"/>
+      </w:pPr>
+    </w:p>
+    <w:p>
+      <w:pPr>
+        <w:spacing w:after="100"/>
+      </w:pPr>
+    </w:p>
+    <w:p>
+      <w:pPr>
+        <w:spacing w:after="100"/>
+      </w:pPr>
+    </w:p>
+    <w:p>
+      <w:pPr>
+        <w:spacing w:after="100"/>
+      </w:pPr>
+    </w:p>
+    <w:p>
+      <w:pPr>
+        <w:spacing w:after="100"/>
+      </w:pPr>
+    </w:p>
+    <w:p>
+      <w:pPr>
+        <w:spacing w:after="100"/>
+      </w:pPr>
+    </w:p>
+    <w:p>
+      <w:pPr>
+        <w:pStyle w:val="Titre1"/>
+      </w:pPr>
+      <w:r>
+        <w:lastRenderedPageBreak/>
+        <w:t>8. Annexe — Hypothèses posées et vérifiées</w:t>
+      </w:r>
+    </w:p>
+    <w:p>
+      <w:pPr>
+        <w:spacing w:after="160"/>
+      </w:pPr>
+      <w:r>
+        <w:t>Plusieurs décisions du projet reposent sur des hypothèses posées puis vérifiées par le test ou l'analyse, plutôt que sur des choix arbitraires. Elles sont formalisées ici a posteriori, sous forme de récapitulatif transversal (certaines ont informé le cahier des charges, d'autres n'ont été découvertes qu'au moment de l'implémentation).</w:t>
+      </w:r>
+    </w:p>
+    <w:tbl>
+      <w:tblPr>
+        <w:tblW w:w="9200" w:type="dxa"/>
+        <w:tblBorders>
+          <w:top w:val="single" w:sz="4" w:space="0" w:color="auto"/>
+          <w:left w:val="single" w:sz="4" w:space="0" w:color="auto"/>
+          <w:bottom w:val="single" w:sz="4" w:space="0" w:color="auto"/>
+          <w:right w:val="single" w:sz="4" w:space="0" w:color="auto"/>
+          <w:insideH w:val="single" w:sz="4" w:space="0" w:color="auto"/>
+          <w:insideV w:val="single" w:sz="4" w:space="0" w:color="auto"/>
+        </w:tblBorders>
+        <w:tblCellMar>
+          <w:left w:w="10" w:type="dxa"/>
+          <w:right w:w="10" w:type="dxa"/>
+        </w:tblCellMar>
+        <w:tblLook w:val="0000" w:firstRow="0" w:lastRow="0" w:firstColumn="0" w:lastColumn="0" w:noHBand="0" w:noVBand="0"/>
+      </w:tblPr>
+      <w:tblGrid>
+        <w:gridCol w:w="2400"/>
+        <w:gridCol w:w="2000"/>
+        <w:gridCol w:w="2400"/>
+        <w:gridCol w:w="2400"/>
+      </w:tblGrid>
+      <w:tr>
         <w:tblPrEx>
           <w:tblCellMar>
             <w:top w:w="0" w:type="dxa"/>
@@ -3689,7 +4068,7 @@
         </w:tblPrEx>
         <w:tc>
           <w:tcPr>
-            <w:tcW w:w="1800" w:type="dxa"/>
+            <w:tcW w:w="2400" w:type="dxa"/>
             <w:shd w:val="clear" w:color="auto" w:fill="E8EEF4"/>
             <w:tcMar>
               <w:top w:w="80" w:type="dxa"/>
@@ -3707,13 +4086,13 @@
                 <w:sz w:val="20"/>
                 <w:szCs w:val="20"/>
               </w:rPr>
-              <w:t>Priorité</w:t>
-            </w:r>
-          </w:p>
-        </w:tc>
-        <w:tc>
-          <w:tcPr>
-            <w:tcW w:w="1400" w:type="dxa"/>
+              <w:t>Hypothèse</w:t>
+            </w:r>
+          </w:p>
+        </w:tc>
+        <w:tc>
+          <w:tcPr>
+            <w:tcW w:w="2000" w:type="dxa"/>
             <w:shd w:val="clear" w:color="auto" w:fill="E8EEF4"/>
             <w:tcMar>
               <w:top w:w="80" w:type="dxa"/>
@@ -3731,13 +4110,13 @@
                 <w:sz w:val="20"/>
                 <w:szCs w:val="20"/>
               </w:rPr>
-              <w:t>Nombre</w:t>
-            </w:r>
-          </w:p>
-        </w:tc>
-        <w:tc>
-          <w:tcPr>
-            <w:tcW w:w="6600" w:type="dxa"/>
+              <w:t>Méthode de vérification</w:t>
+            </w:r>
+          </w:p>
+        </w:tc>
+        <w:tc>
+          <w:tcPr>
+            <w:tcW w:w="2400" w:type="dxa"/>
             <w:shd w:val="clear" w:color="auto" w:fill="E8EEF4"/>
             <w:tcMar>
               <w:top w:w="80" w:type="dxa"/>
@@ -3755,7 +4134,31 @@
                 <w:sz w:val="20"/>
                 <w:szCs w:val="20"/>
               </w:rPr>
-              <w:t>Nature</w:t>
+              <w:t>Résultat</w:t>
+            </w:r>
+          </w:p>
+        </w:tc>
+        <w:tc>
+          <w:tcPr>
+            <w:tcW w:w="2400" w:type="dxa"/>
+            <w:shd w:val="clear" w:color="auto" w:fill="E8EEF4"/>
+            <w:tcMar>
+              <w:top w:w="80" w:type="dxa"/>
+              <w:left w:w="100" w:type="dxa"/>
+              <w:bottom w:w="80" w:type="dxa"/>
+              <w:right w:w="100" w:type="dxa"/>
+            </w:tcMar>
+          </w:tcPr>
+          <w:p>
+            <w:r>
+              <w:rPr>
+                <w:b/>
+                <w:bCs/>
+                <w:color w:val="000000"/>
+                <w:sz w:val="20"/>
+                <w:szCs w:val="20"/>
+              </w:rPr>
+              <w:t>Impact sur le projet</w:t>
             </w:r>
           </w:p>
         </w:tc>
@@ -3769,64 +4172,85 @@
         </w:tblPrEx>
         <w:tc>
           <w:tcPr>
-            <w:tcW w:w="1800" w:type="dxa"/>
-            <w:tcMar>
-              <w:top w:w="80" w:type="dxa"/>
-              <w:left w:w="100" w:type="dxa"/>
-              <w:bottom w:w="80" w:type="dxa"/>
-              <w:right w:w="100" w:type="dxa"/>
-            </w:tcMar>
-          </w:tcPr>
-          <w:p>
-            <w:r>
-              <w:rPr>
-                <w:color w:val="000000"/>
-                <w:sz w:val="20"/>
-                <w:szCs w:val="20"/>
-              </w:rPr>
-              <w:t>Critique</w:t>
-            </w:r>
-          </w:p>
-        </w:tc>
-        <w:tc>
-          <w:tcPr>
-            <w:tcW w:w="1400" w:type="dxa"/>
-            <w:tcMar>
-              <w:top w:w="80" w:type="dxa"/>
-              <w:left w:w="100" w:type="dxa"/>
-              <w:bottom w:w="80" w:type="dxa"/>
-              <w:right w:w="100" w:type="dxa"/>
-            </w:tcMar>
-          </w:tcPr>
-          <w:p>
-            <w:r>
-              <w:rPr>
-                <w:color w:val="000000"/>
-                <w:sz w:val="20"/>
-                <w:szCs w:val="20"/>
-              </w:rPr>
-              <w:t>9</w:t>
-            </w:r>
-          </w:p>
-        </w:tc>
-        <w:tc>
-          <w:tcPr>
-            <w:tcW w:w="6600" w:type="dxa"/>
-            <w:tcMar>
-              <w:top w:w="80" w:type="dxa"/>
-              <w:left w:w="100" w:type="dxa"/>
-              <w:bottom w:w="80" w:type="dxa"/>
-              <w:right w:w="100" w:type="dxa"/>
-            </w:tcMar>
-          </w:tcPr>
-          <w:p>
-            <w:r>
-              <w:rPr>
-                <w:color w:val="000000"/>
-                <w:sz w:val="20"/>
-                <w:szCs w:val="20"/>
-              </w:rPr>
-              <w:t>Prix négatifs, stocks négatifs, marge négative (vente à perte)</w:t>
+            <w:tcW w:w="2400" w:type="dxa"/>
+            <w:tcMar>
+              <w:top w:w="80" w:type="dxa"/>
+              <w:left w:w="100" w:type="dxa"/>
+              <w:bottom w:w="80" w:type="dxa"/>
+              <w:right w:w="100" w:type="dxa"/>
+            </w:tcMar>
+          </w:tcPr>
+          <w:p>
+            <w:r>
+              <w:rPr>
+                <w:color w:val="000000"/>
+                <w:sz w:val="20"/>
+                <w:szCs w:val="20"/>
+              </w:rPr>
+              <w:t>Le ML prédictif (régression) aurait un faible pouvoir explicatif sur les ventes</w:t>
+            </w:r>
+          </w:p>
+        </w:tc>
+        <w:tc>
+          <w:tcPr>
+            <w:tcW w:w="2000" w:type="dxa"/>
+            <w:tcMar>
+              <w:top w:w="80" w:type="dxa"/>
+              <w:left w:w="100" w:type="dxa"/>
+              <w:bottom w:w="80" w:type="dxa"/>
+              <w:right w:w="100" w:type="dxa"/>
+            </w:tcMar>
+          </w:tcPr>
+          <w:p>
+            <w:r>
+              <w:rPr>
+                <w:color w:val="000000"/>
+                <w:sz w:val="20"/>
+                <w:szCs w:val="20"/>
+              </w:rPr>
+              <w:t>Calcul des corrélations (prix/ventes)</w:t>
+            </w:r>
+          </w:p>
+        </w:tc>
+        <w:tc>
+          <w:tcPr>
+            <w:tcW w:w="2400" w:type="dxa"/>
+            <w:tcMar>
+              <w:top w:w="80" w:type="dxa"/>
+              <w:left w:w="100" w:type="dxa"/>
+              <w:bottom w:w="80" w:type="dxa"/>
+              <w:right w:w="100" w:type="dxa"/>
+            </w:tcMar>
+          </w:tcPr>
+          <w:p>
+            <w:r>
+              <w:rPr>
+                <w:color w:val="000000"/>
+                <w:sz w:val="20"/>
+                <w:szCs w:val="20"/>
+              </w:rPr>
+              <w:t>Confirmée (-0,52 → R² ≈ 0,27, insuffisant)</w:t>
+            </w:r>
+          </w:p>
+        </w:tc>
+        <w:tc>
+          <w:tcPr>
+            <w:tcW w:w="2400" w:type="dxa"/>
+            <w:tcMar>
+              <w:top w:w="80" w:type="dxa"/>
+              <w:left w:w="100" w:type="dxa"/>
+              <w:bottom w:w="80" w:type="dxa"/>
+              <w:right w:w="100" w:type="dxa"/>
+            </w:tcMar>
+          </w:tcPr>
+          <w:p>
+            <w:r>
+              <w:rPr>
+                <w:color w:val="000000"/>
+                <w:sz w:val="20"/>
+                <w:szCs w:val="20"/>
+              </w:rPr>
+              <w:t>Régression écartée ; clustering conservé comme piste optionnelle uniquement</w:t>
             </w:r>
           </w:p>
         </w:tc>
@@ -3840,65 +4264,15 @@
         </w:tblPrEx>
         <w:tc>
           <w:tcPr>
-            <w:tcW w:w="1800" w:type="dxa"/>
-            <w:tcMar>
-              <w:top w:w="80" w:type="dxa"/>
-              <w:left w:w="100" w:type="dxa"/>
-              <w:bottom w:w="80" w:type="dxa"/>
-              <w:right w:w="100" w:type="dxa"/>
-            </w:tcMar>
-          </w:tcPr>
-          <w:p>
-            <w:r>
-              <w:rPr>
-                <w:color w:val="000000"/>
-                <w:sz w:val="20"/>
-                <w:szCs w:val="20"/>
-              </w:rPr>
-              <w:t>Majeure</w:t>
-            </w:r>
-          </w:p>
-        </w:tc>
-        <w:tc>
-          <w:tcPr>
-            <w:tcW w:w="1400" w:type="dxa"/>
-            <w:tcMar>
-              <w:top w:w="80" w:type="dxa"/>
-              <w:left w:w="100" w:type="dxa"/>
-              <w:bottom w:w="80" w:type="dxa"/>
-              <w:right w:w="100" w:type="dxa"/>
-            </w:tcMar>
-          </w:tcPr>
-          <w:p>
-            <w:r>
-              <w:rPr>
-                <w:color w:val="000000"/>
-                <w:sz w:val="20"/>
-                <w:szCs w:val="20"/>
-              </w:rPr>
-              <w:t>0</w:t>
-            </w:r>
-          </w:p>
-        </w:tc>
-        <w:tc>
-          <w:tcPr>
-            <w:tcW w:w="6600" w:type="dxa"/>
-            <w:tcMar>
-              <w:top w:w="80" w:type="dxa"/>
-              <w:left w:w="100" w:type="dxa"/>
-              <w:bottom w:w="80" w:type="dxa"/>
-              <w:right w:w="100" w:type="dxa"/>
-            </w:tcMar>
-          </w:tcPr>
-          <w:p>
-            <w:r>
-              <w:rPr>
-                <w:color w:val="000000"/>
-                <w:sz w:val="20"/>
-                <w:szCs w:val="20"/>
-              </w:rPr>
-              <w:t xml:space="preserve">Incohérence stock déjà corrigée manuellement dans le P6 — validé par </w:t>
-            </w:r>
+            <w:tcW w:w="2400" w:type="dxa"/>
+            <w:tcMar>
+              <w:top w:w="80" w:type="dxa"/>
+              <w:left w:w="100" w:type="dxa"/>
+              <w:bottom w:w="80" w:type="dxa"/>
+              <w:right w:w="100" w:type="dxa"/>
+            </w:tcMar>
+          </w:tcPr>
+          <w:p>
             <w:proofErr w:type="spellStart"/>
             <w:r>
               <w:rPr>
@@ -3909,6 +4283,105 @@
               <w:t>Pandera</w:t>
             </w:r>
             <w:proofErr w:type="spellEnd"/>
+            <w:r>
+              <w:rPr>
+                <w:color w:val="000000"/>
+                <w:sz w:val="20"/>
+                <w:szCs w:val="20"/>
+              </w:rPr>
+              <w:t xml:space="preserve"> serait plus adapté que Great Expectations pour un usage solo</w:t>
+            </w:r>
+          </w:p>
+        </w:tc>
+        <w:tc>
+          <w:tcPr>
+            <w:tcW w:w="2000" w:type="dxa"/>
+            <w:tcMar>
+              <w:top w:w="80" w:type="dxa"/>
+              <w:left w:w="100" w:type="dxa"/>
+              <w:bottom w:w="80" w:type="dxa"/>
+              <w:right w:w="100" w:type="dxa"/>
+            </w:tcMar>
+          </w:tcPr>
+          <w:p>
+            <w:r>
+              <w:rPr>
+                <w:color w:val="000000"/>
+                <w:sz w:val="20"/>
+                <w:szCs w:val="20"/>
+              </w:rPr>
+              <w:t>Test comparatif réel sur les données</w:t>
+            </w:r>
+          </w:p>
+        </w:tc>
+        <w:tc>
+          <w:tcPr>
+            <w:tcW w:w="2400" w:type="dxa"/>
+            <w:tcMar>
+              <w:top w:w="80" w:type="dxa"/>
+              <w:left w:w="100" w:type="dxa"/>
+              <w:bottom w:w="80" w:type="dxa"/>
+              <w:right w:w="100" w:type="dxa"/>
+            </w:tcMar>
+          </w:tcPr>
+          <w:p>
+            <w:r>
+              <w:rPr>
+                <w:color w:val="000000"/>
+                <w:sz w:val="20"/>
+                <w:szCs w:val="20"/>
+              </w:rPr>
+              <w:t>Confirmée (temps, setup, dépendances)</w:t>
+            </w:r>
+          </w:p>
+        </w:tc>
+        <w:tc>
+          <w:tcPr>
+            <w:tcW w:w="2400" w:type="dxa"/>
+            <w:tcMar>
+              <w:top w:w="80" w:type="dxa"/>
+              <w:left w:w="100" w:type="dxa"/>
+              <w:bottom w:w="80" w:type="dxa"/>
+              <w:right w:w="100" w:type="dxa"/>
+            </w:tcMar>
+          </w:tcPr>
+          <w:p>
+            <w:proofErr w:type="spellStart"/>
+            <w:r>
+              <w:rPr>
+                <w:color w:val="000000"/>
+                <w:sz w:val="20"/>
+                <w:szCs w:val="20"/>
+              </w:rPr>
+              <w:t>Pandera</w:t>
+            </w:r>
+            <w:proofErr w:type="spellEnd"/>
+            <w:r>
+              <w:rPr>
+                <w:color w:val="000000"/>
+                <w:sz w:val="20"/>
+                <w:szCs w:val="20"/>
+              </w:rPr>
+              <w:t xml:space="preserve"> retenu comme solution technique de l'axe C, structure du notebook et </w:t>
+            </w:r>
+            <w:proofErr w:type="gramStart"/>
+            <w:r>
+              <w:rPr>
+                <w:color w:val="000000"/>
+                <w:sz w:val="20"/>
+                <w:szCs w:val="20"/>
+              </w:rPr>
+              <w:t>des scripts basée</w:t>
+            </w:r>
+            <w:proofErr w:type="gramEnd"/>
+            <w:r>
+              <w:rPr>
+                <w:color w:val="000000"/>
+                <w:sz w:val="20"/>
+                <w:szCs w:val="20"/>
+              </w:rPr>
+              <w:t xml:space="preserve"> dessus</w:t>
+            </w:r>
           </w:p>
         </w:tc>
       </w:tr>
@@ -3921,64 +4394,22 @@
         </w:tblPrEx>
         <w:tc>
           <w:tcPr>
-            <w:tcW w:w="1800" w:type="dxa"/>
-            <w:tcMar>
-              <w:top w:w="80" w:type="dxa"/>
-              <w:left w:w="100" w:type="dxa"/>
-              <w:bottom w:w="80" w:type="dxa"/>
-              <w:right w:w="100" w:type="dxa"/>
-            </w:tcMar>
-          </w:tcPr>
-          <w:p>
-            <w:r>
-              <w:rPr>
-                <w:color w:val="000000"/>
-                <w:sz w:val="20"/>
-                <w:szCs w:val="20"/>
-              </w:rPr>
-              <w:t>Mineure</w:t>
-            </w:r>
-          </w:p>
-        </w:tc>
-        <w:tc>
-          <w:tcPr>
-            <w:tcW w:w="1400" w:type="dxa"/>
-            <w:tcMar>
-              <w:top w:w="80" w:type="dxa"/>
-              <w:left w:w="100" w:type="dxa"/>
-              <w:bottom w:w="80" w:type="dxa"/>
-              <w:right w:w="100" w:type="dxa"/>
-            </w:tcMar>
-          </w:tcPr>
-          <w:p>
-            <w:r>
-              <w:rPr>
-                <w:color w:val="000000"/>
-                <w:sz w:val="20"/>
-                <w:szCs w:val="20"/>
-              </w:rPr>
-              <w:t>2</w:t>
-            </w:r>
-          </w:p>
-        </w:tc>
-        <w:tc>
-          <w:tcPr>
-            <w:tcW w:w="6600" w:type="dxa"/>
-            <w:tcMar>
-              <w:top w:w="80" w:type="dxa"/>
-              <w:left w:w="100" w:type="dxa"/>
-              <w:bottom w:w="80" w:type="dxa"/>
-              <w:right w:w="100" w:type="dxa"/>
-            </w:tcMar>
-          </w:tcPr>
-          <w:p>
-            <w:r>
-              <w:rPr>
-                <w:color w:val="000000"/>
-                <w:sz w:val="20"/>
-                <w:szCs w:val="20"/>
-              </w:rPr>
-              <w:t xml:space="preserve">Format </w:t>
+            <w:tcW w:w="2400" w:type="dxa"/>
+            <w:tcMar>
+              <w:top w:w="80" w:type="dxa"/>
+              <w:left w:w="100" w:type="dxa"/>
+              <w:bottom w:w="80" w:type="dxa"/>
+              <w:right w:w="100" w:type="dxa"/>
+            </w:tcMar>
+          </w:tcPr>
+          <w:p>
+            <w:r>
+              <w:rPr>
+                <w:color w:val="000000"/>
+                <w:sz w:val="20"/>
+                <w:szCs w:val="20"/>
+              </w:rPr>
+              <w:t xml:space="preserve">Le </w:t>
             </w:r>
             <w:proofErr w:type="spellStart"/>
             <w:r>
@@ -3987,7 +4418,7 @@
                 <w:sz w:val="20"/>
                 <w:szCs w:val="20"/>
               </w:rPr>
-              <w:t>sku</w:t>
+              <w:t>dataset</w:t>
             </w:r>
             <w:proofErr w:type="spellEnd"/>
             <w:r>
@@ -3996,7 +4427,272 @@
                 <w:sz w:val="20"/>
                 <w:szCs w:val="20"/>
               </w:rPr>
-              <w:t xml:space="preserve"> non numérique (dont un bon cadeau, pas un vrai produit)</w:t>
+              <w:t xml:space="preserve"> ne contient pas de données personnelles (RGPD)</w:t>
+            </w:r>
+          </w:p>
+        </w:tc>
+        <w:tc>
+          <w:tcPr>
+            <w:tcW w:w="2000" w:type="dxa"/>
+            <w:tcMar>
+              <w:top w:w="80" w:type="dxa"/>
+              <w:left w:w="100" w:type="dxa"/>
+              <w:bottom w:w="80" w:type="dxa"/>
+              <w:right w:w="100" w:type="dxa"/>
+            </w:tcMar>
+          </w:tcPr>
+          <w:p>
+            <w:r>
+              <w:rPr>
+                <w:color w:val="000000"/>
+                <w:sz w:val="20"/>
+                <w:szCs w:val="20"/>
+              </w:rPr>
+              <w:t>Relecture manuelle des colonnes des 3 fichiers</w:t>
+            </w:r>
+          </w:p>
+        </w:tc>
+        <w:tc>
+          <w:tcPr>
+            <w:tcW w:w="2400" w:type="dxa"/>
+            <w:tcMar>
+              <w:top w:w="80" w:type="dxa"/>
+              <w:left w:w="100" w:type="dxa"/>
+              <w:bottom w:w="80" w:type="dxa"/>
+              <w:right w:w="100" w:type="dxa"/>
+            </w:tcMar>
+          </w:tcPr>
+          <w:p>
+            <w:r>
+              <w:rPr>
+                <w:color w:val="000000"/>
+                <w:sz w:val="20"/>
+                <w:szCs w:val="20"/>
+              </w:rPr>
+              <w:t>Confirmée</w:t>
+            </w:r>
+          </w:p>
+        </w:tc>
+        <w:tc>
+          <w:tcPr>
+            <w:tcW w:w="2400" w:type="dxa"/>
+            <w:tcMar>
+              <w:top w:w="80" w:type="dxa"/>
+              <w:left w:w="100" w:type="dxa"/>
+              <w:bottom w:w="80" w:type="dxa"/>
+              <w:right w:w="100" w:type="dxa"/>
+            </w:tcMar>
+          </w:tcPr>
+          <w:p>
+            <w:r>
+              <w:rPr>
+                <w:color w:val="000000"/>
+                <w:sz w:val="20"/>
+                <w:szCs w:val="20"/>
+              </w:rPr>
+              <w:t>Aucune contrainte RGPD à traiter, périmètre simplifié</w:t>
+            </w:r>
+          </w:p>
+        </w:tc>
+      </w:tr>
+      <w:tr>
+        <w:tblPrEx>
+          <w:tblCellMar>
+            <w:top w:w="0" w:type="dxa"/>
+            <w:bottom w:w="0" w:type="dxa"/>
+          </w:tblCellMar>
+        </w:tblPrEx>
+        <w:tc>
+          <w:tcPr>
+            <w:tcW w:w="2400" w:type="dxa"/>
+            <w:tcMar>
+              <w:top w:w="80" w:type="dxa"/>
+              <w:left w:w="100" w:type="dxa"/>
+              <w:bottom w:w="80" w:type="dxa"/>
+              <w:right w:w="100" w:type="dxa"/>
+            </w:tcMar>
+          </w:tcPr>
+          <w:p>
+            <w:r>
+              <w:rPr>
+                <w:color w:val="000000"/>
+                <w:sz w:val="20"/>
+                <w:szCs w:val="20"/>
+              </w:rPr>
+              <w:t>Les vérifications manuelles du P6 original comportent des angles morts</w:t>
+            </w:r>
+          </w:p>
+        </w:tc>
+        <w:tc>
+          <w:tcPr>
+            <w:tcW w:w="2000" w:type="dxa"/>
+            <w:tcMar>
+              <w:top w:w="80" w:type="dxa"/>
+              <w:left w:w="100" w:type="dxa"/>
+              <w:bottom w:w="80" w:type="dxa"/>
+              <w:right w:w="100" w:type="dxa"/>
+            </w:tcMar>
+          </w:tcPr>
+          <w:p>
+            <w:r>
+              <w:rPr>
+                <w:color w:val="000000"/>
+                <w:sz w:val="20"/>
+                <w:szCs w:val="20"/>
+              </w:rPr>
+              <w:t>Exécution complète du notebook + rapport d'anomalies</w:t>
+            </w:r>
+          </w:p>
+        </w:tc>
+        <w:tc>
+          <w:tcPr>
+            <w:tcW w:w="2400" w:type="dxa"/>
+            <w:tcMar>
+              <w:top w:w="80" w:type="dxa"/>
+              <w:left w:w="100" w:type="dxa"/>
+              <w:bottom w:w="80" w:type="dxa"/>
+              <w:right w:w="100" w:type="dxa"/>
+            </w:tcMar>
+          </w:tcPr>
+          <w:p>
+            <w:r>
+              <w:rPr>
+                <w:color w:val="000000"/>
+                <w:sz w:val="20"/>
+                <w:szCs w:val="20"/>
+              </w:rPr>
+              <w:t>Confirmée (bug Lorenz/Gini, 4 ventes à perte invisibles)</w:t>
+            </w:r>
+          </w:p>
+        </w:tc>
+        <w:tc>
+          <w:tcPr>
+            <w:tcW w:w="2400" w:type="dxa"/>
+            <w:tcMar>
+              <w:top w:w="80" w:type="dxa"/>
+              <w:left w:w="100" w:type="dxa"/>
+              <w:bottom w:w="80" w:type="dxa"/>
+              <w:right w:w="100" w:type="dxa"/>
+            </w:tcMar>
+          </w:tcPr>
+          <w:p>
+            <w:r>
+              <w:rPr>
+                <w:color w:val="000000"/>
+                <w:sz w:val="20"/>
+                <w:szCs w:val="20"/>
+              </w:rPr>
+              <w:t>Légitime le projet dans son ensemble ; bug corrigé dans le notebook livré</w:t>
+            </w:r>
+          </w:p>
+        </w:tc>
+      </w:tr>
+      <w:tr>
+        <w:tblPrEx>
+          <w:tblCellMar>
+            <w:top w:w="0" w:type="dxa"/>
+            <w:bottom w:w="0" w:type="dxa"/>
+          </w:tblCellMar>
+        </w:tblPrEx>
+        <w:tc>
+          <w:tcPr>
+            <w:tcW w:w="2400" w:type="dxa"/>
+            <w:tcMar>
+              <w:top w:w="80" w:type="dxa"/>
+              <w:left w:w="100" w:type="dxa"/>
+              <w:bottom w:w="80" w:type="dxa"/>
+              <w:right w:w="100" w:type="dxa"/>
+            </w:tcMar>
+          </w:tcPr>
+          <w:p>
+            <w:r>
+              <w:rPr>
+                <w:color w:val="000000"/>
+                <w:sz w:val="20"/>
+                <w:szCs w:val="20"/>
+              </w:rPr>
+              <w:t>La correction manuelle de cohérence stock du P6 fonctionnait correctement</w:t>
+            </w:r>
+          </w:p>
+        </w:tc>
+        <w:tc>
+          <w:tcPr>
+            <w:tcW w:w="2000" w:type="dxa"/>
+            <w:tcMar>
+              <w:top w:w="80" w:type="dxa"/>
+              <w:left w:w="100" w:type="dxa"/>
+              <w:bottom w:w="80" w:type="dxa"/>
+              <w:right w:w="100" w:type="dxa"/>
+            </w:tcMar>
+          </w:tcPr>
+          <w:p>
+            <w:r>
+              <w:rPr>
+                <w:color w:val="000000"/>
+                <w:sz w:val="20"/>
+                <w:szCs w:val="20"/>
+              </w:rPr>
+              <w:t xml:space="preserve">Validation </w:t>
+            </w:r>
+            <w:proofErr w:type="spellStart"/>
+            <w:r>
+              <w:rPr>
+                <w:color w:val="000000"/>
+                <w:sz w:val="20"/>
+                <w:szCs w:val="20"/>
+              </w:rPr>
+              <w:t>Pandera</w:t>
+            </w:r>
+            <w:proofErr w:type="spellEnd"/>
+            <w:r>
+              <w:rPr>
+                <w:color w:val="000000"/>
+                <w:sz w:val="20"/>
+                <w:szCs w:val="20"/>
+              </w:rPr>
+              <w:t xml:space="preserve"> post-correction</w:t>
+            </w:r>
+          </w:p>
+        </w:tc>
+        <w:tc>
+          <w:tcPr>
+            <w:tcW w:w="2400" w:type="dxa"/>
+            <w:tcMar>
+              <w:top w:w="80" w:type="dxa"/>
+              <w:left w:w="100" w:type="dxa"/>
+              <w:bottom w:w="80" w:type="dxa"/>
+              <w:right w:w="100" w:type="dxa"/>
+            </w:tcMar>
+          </w:tcPr>
+          <w:p>
+            <w:r>
+              <w:rPr>
+                <w:color w:val="000000"/>
+                <w:sz w:val="20"/>
+                <w:szCs w:val="20"/>
+              </w:rPr>
+              <w:t>Confirmée (0 anomalie « Majeure » détectée)</w:t>
+            </w:r>
+          </w:p>
+        </w:tc>
+        <w:tc>
+          <w:tcPr>
+            <w:tcW w:w="2400" w:type="dxa"/>
+            <w:tcMar>
+              <w:top w:w="80" w:type="dxa"/>
+              <w:left w:w="100" w:type="dxa"/>
+              <w:bottom w:w="80" w:type="dxa"/>
+              <w:right w:w="100" w:type="dxa"/>
+            </w:tcMar>
+          </w:tcPr>
+          <w:p>
+            <w:r>
+              <w:rPr>
+                <w:color w:val="000000"/>
+                <w:sz w:val="20"/>
+                <w:szCs w:val="20"/>
+              </w:rPr>
+              <w:t>Valide le travail existant du P6 plutôt que de seulement chercher des erreurs — renforce la crédibilité du diagnostic</w:t>
             </w:r>
           </w:p>
         </w:tc>
@@ -4004,202 +4700,10 @@
     </w:tbl>
     <w:p>
       <w:pPr>
-        <w:spacing w:after="100"/>
-      </w:pPr>
-    </w:p>
-    <w:p>
-      <w:pPr>
-        <w:spacing w:after="160"/>
-      </w:pPr>
-      <w:r>
-        <w:lastRenderedPageBreak/>
-        <w:t>Point notable : l'absence d'anomalies « Majeure » confirme que la correction manuelle de cohérence stock du P6 original fonctionnait correctement — la validation automatisée ne se contente donc pas de détecter des erreurs, elle valide aussi la fiabilité du travail existant. Par ailleurs, 4 cas de vente à perte ont été détectés sans que le prix soit négatif (prix positif mais inférieur au prix d'achat) — invisibles avec le contrôle initial du P6, qui ne vérifiait que le signe du prix.</w:t>
-      </w:r>
-    </w:p>
-    <w:p>
-      <w:pPr>
         <w:pStyle w:val="Titre1"/>
       </w:pPr>
       <w:r>
-        <w:t>7. Limites et prochaines pistes</w:t>
-      </w:r>
-    </w:p>
-    <w:p>
-      <w:pPr>
-        <w:pStyle w:val="Titre3"/>
-      </w:pPr>
-      <w:r>
-        <w:t>7.1 — Limites assumées</w:t>
-      </w:r>
-    </w:p>
-    <w:p>
-      <w:pPr>
-        <w:pStyle w:val="Paragraphedeliste"/>
-        <w:numPr>
-          <w:ilvl w:val="0"/>
-          <w:numId w:val="1"/>
-        </w:numPr>
-        <w:spacing w:after="80"/>
-      </w:pPr>
-      <w:r>
-        <w:t>Axes détection d'anomalies avancée (Isolation Forest / LOF) et clustering non développés — recentrage du périmètre sur un axe traité en profondeur, cohérent avec un contexte de travail individuel</w:t>
-      </w:r>
-    </w:p>
-    <w:p>
-      <w:pPr>
-        <w:pStyle w:val="Paragraphedeliste"/>
-        <w:numPr>
-          <w:ilvl w:val="0"/>
-          <w:numId w:val="1"/>
-        </w:numPr>
-        <w:spacing w:after="80"/>
-      </w:pPr>
-      <w:r>
-        <w:t>L'outil détecte les anomalies mais ne les corrige pas automatiquement — la décision de correction reste humaine, volontairement</w:t>
-      </w:r>
-    </w:p>
-    <w:p>
-      <w:pPr>
-        <w:pStyle w:val="Paragraphedeliste"/>
-        <w:numPr>
-          <w:ilvl w:val="0"/>
-          <w:numId w:val="1"/>
-        </w:numPr>
-        <w:spacing w:after="80"/>
-      </w:pPr>
-      <w:r>
-        <w:t>Pas de dimension temporelle exploitée (photo du catalogue à un instant T)</w:t>
-      </w:r>
-    </w:p>
-    <w:p>
-      <w:pPr>
-        <w:pStyle w:val="Titre3"/>
-      </w:pPr>
-      <w:r>
-        <w:t>7.2 — Prochaines pistes</w:t>
-      </w:r>
-    </w:p>
-    <w:p>
-      <w:pPr>
-        <w:pStyle w:val="Paragraphedeliste"/>
-        <w:numPr>
-          <w:ilvl w:val="0"/>
-          <w:numId w:val="1"/>
-        </w:numPr>
-        <w:spacing w:after="80"/>
-      </w:pPr>
-      <w:r>
-        <w:t>Clustering du catalogue (K-</w:t>
-      </w:r>
-      <w:proofErr w:type="spellStart"/>
-      <w:r>
-        <w:t>means</w:t>
-      </w:r>
-      <w:proofErr w:type="spellEnd"/>
-      <w:r>
-        <w:t xml:space="preserve"> vs DBSCAN) pour une segmentation marketing</w:t>
-      </w:r>
-    </w:p>
-    <w:p>
-      <w:pPr>
-        <w:pStyle w:val="Paragraphedeliste"/>
-        <w:numPr>
-          <w:ilvl w:val="0"/>
-          <w:numId w:val="1"/>
-        </w:numPr>
-        <w:spacing w:after="80"/>
-      </w:pPr>
-      <w:r>
-        <w:t>Extension du rapport d'anomalies avec un suivi de correction dans le temps (avant / après) — piste à forte valeur ajoutée pour objectiver l'amélioration de la qualité catalogue dans la durée. Effort estimé : 3 à 4h (stockage d'un historique de rapports horodatés + logique de comparaison entre deux exécutions)</w:t>
-      </w:r>
-    </w:p>
-    <w:p>
-      <w:pPr>
-        <w:pStyle w:val="Paragraphedeliste"/>
-        <w:numPr>
-          <w:ilvl w:val="0"/>
-          <w:numId w:val="1"/>
-        </w:numPr>
-        <w:spacing w:after="80"/>
-      </w:pPr>
-      <w:r>
-        <w:t xml:space="preserve">Industrialisation légère : exécution automatique du contrôle qualité à chaque nouvel import de fichier source. Dans un contexte professionnel réel, cette étape serait indispensable — mais le choix de la bonne méthode dépend d'informations non disponibles à ce stade (comment les fichiers </w:t>
-      </w:r>
-      <w:proofErr w:type="spellStart"/>
-      <w:r>
-        <w:t>erp</w:t>
-      </w:r>
-      <w:proofErr w:type="spellEnd"/>
-      <w:r>
-        <w:t>/web/liaison sont-ils réellement générés et déposés : export manuel, job planifié, dépôt sur un espace partagé ?). Trois approches possibles, par ordre de complexité croissante :</w:t>
-      </w:r>
-    </w:p>
-    <w:p>
-      <w:pPr>
-        <w:pStyle w:val="Paragraphedeliste"/>
-        <w:numPr>
-          <w:ilvl w:val="1"/>
-          <w:numId w:val="1"/>
-        </w:numPr>
-        <w:spacing w:after="100"/>
-      </w:pPr>
-      <w:r>
-        <w:rPr>
-          <w:b/>
-          <w:bCs/>
-        </w:rPr>
-        <w:t xml:space="preserve">Exécution manuelle guidée — </w:t>
-      </w:r>
-      <w:r>
-        <w:t>un script/commande unique à lancer après chaque nouvel export. Le plus simple, ne dépend d'aucune information sur le processus amont, mais demande encore une action humaine pour déclencher. Effort estimé : 1h.</w:t>
-      </w:r>
-    </w:p>
-    <w:p>
-      <w:pPr>
-        <w:pStyle w:val="Paragraphedeliste"/>
-        <w:numPr>
-          <w:ilvl w:val="1"/>
-          <w:numId w:val="1"/>
-        </w:numPr>
-        <w:spacing w:after="100"/>
-      </w:pPr>
-      <w:r>
-        <w:rPr>
-          <w:b/>
-          <w:bCs/>
-        </w:rPr>
-        <w:t xml:space="preserve">Surveillance de dossier (file watcher) — </w:t>
-      </w:r>
-      <w:r>
-        <w:t>un script en tâche de fond qui détecte automatiquement l'arrivée d'un nouveau fichier dans un dossier partagé (réseau, Drive synchronisé) et lance la validation sans intervention. Pertinent si les fichiers sont déposés manuellement mais régulièrement au même endroit. Effort estimé : 2 à 3h.</w:t>
-      </w:r>
-    </w:p>
-    <w:p>
-      <w:pPr>
-        <w:pStyle w:val="Paragraphedeliste"/>
-        <w:numPr>
-          <w:ilvl w:val="1"/>
-          <w:numId w:val="1"/>
-        </w:numPr>
-        <w:spacing w:after="100"/>
-      </w:pPr>
-      <w:r>
-        <w:rPr>
-          <w:b/>
-          <w:bCs/>
-        </w:rPr>
-        <w:t xml:space="preserve">Intégration CI/CD (ex : GitHub Actions) — </w:t>
-      </w:r>
-      <w:r>
-        <w:t>déclenchement automatique de la validation à chaque nouveau dépôt de fichier sur le repo. La plus "industrielle" des trois, mais suppose que les fichiers sources transitent eux-mêmes par un flux versionné — hypothèse à vérifier avec l'IT en contexte professionnel réel. Effort estimé : 4 à 5h.</w:t>
-      </w:r>
-    </w:p>
-    <w:p>
-      <w:pPr>
-        <w:pStyle w:val="Titre1"/>
-      </w:pPr>
-      <w:r>
-        <w:t>8. Annexe — Traçabilité des prompts IA</w:t>
+        <w:t>9. Annexe — Traçabilité des prompts IA</w:t>
       </w:r>
     </w:p>
     <w:p>
@@ -4357,16 +4861,7 @@
                 <w:sz w:val="20"/>
                 <w:szCs w:val="20"/>
               </w:rPr>
-              <w:t xml:space="preserve">Tu vas être à la fois mon assistant et mon rédacteur de documentation, je serai le chef de </w:t>
-            </w:r>
-            <w:r>
-              <w:rPr>
-                <w:color w:val="000000"/>
-                <w:sz w:val="20"/>
-                <w:szCs w:val="20"/>
-              </w:rPr>
-              <w:lastRenderedPageBreak/>
-              <w:t>mission. Je te mets en pièces jointes les documents d'attendus et de missions du projet. Tu dois : y répondre, justifier tes choix, documenter tes choix. Commence par lire les missions et les livrables et propose-moi un plan pour mettre en place les actions à mener.</w:t>
+              <w:t>Tu vas être à la fois mon assistant et mon rédacteur de documentation, je serai le chef de mission. Je te mets en pièces jointes les documents d'attendus et de missions du projet. Tu dois : y répondre, justifier tes choix, documenter tes choix. Commence par lire les missions et les livrables et propose-moi un plan pour mettre en place les actions à mener.</w:t>
             </w:r>
           </w:p>
         </w:tc>
@@ -4387,17 +4882,7 @@
                 <w:sz w:val="20"/>
                 <w:szCs w:val="20"/>
               </w:rPr>
-              <w:lastRenderedPageBreak/>
-              <w:t xml:space="preserve">Structuration du projet en 7 phases (cadrage, </w:t>
-            </w:r>
-            <w:r>
-              <w:rPr>
-                <w:color w:val="000000"/>
-                <w:sz w:val="20"/>
-                <w:szCs w:val="20"/>
-              </w:rPr>
-              <w:lastRenderedPageBreak/>
-              <w:t>veille, cahier des charges, organisation, exécution, documentation, portfolio)</w:t>
+              <w:t>Structuration du projet en 7 phases (cadrage, veille, cahier des charges, organisation, exécution, documentation, portfolio)</w:t>
             </w:r>
           </w:p>
         </w:tc>
@@ -4426,7 +4911,6 @@
                 <w:sz w:val="20"/>
                 <w:szCs w:val="20"/>
               </w:rPr>
-              <w:lastRenderedPageBreak/>
               <w:t xml:space="preserve">Pertinence du ML sur le </w:t>
             </w:r>
             <w:proofErr w:type="spellStart"/>
@@ -4582,7 +5066,7 @@
         <w:pStyle w:val="Titre1"/>
       </w:pPr>
       <w:r>
-        <w:t>9. Ressources du projet</w:t>
+        <w:t>10. Ressources du projet</w:t>
       </w:r>
     </w:p>
     <w:p>
@@ -4590,7 +5074,7 @@
         <w:pStyle w:val="Paragraphedeliste"/>
         <w:numPr>
           <w:ilvl w:val="0"/>
-          <w:numId w:val="1"/>
+          <w:numId w:val="2"/>
         </w:numPr>
         <w:spacing w:after="80"/>
       </w:pPr>
@@ -4611,7 +5095,7 @@
         <w:pStyle w:val="Paragraphedeliste"/>
         <w:numPr>
           <w:ilvl w:val="0"/>
-          <w:numId w:val="1"/>
+          <w:numId w:val="2"/>
         </w:numPr>
         <w:spacing w:after="80"/>
       </w:pPr>
@@ -4624,7 +5108,7 @@
         <w:pStyle w:val="Paragraphedeliste"/>
         <w:numPr>
           <w:ilvl w:val="0"/>
-          <w:numId w:val="1"/>
+          <w:numId w:val="2"/>
         </w:numPr>
         <w:spacing w:after="80"/>
       </w:pPr>
@@ -4637,13 +5121,18 @@
         <w:pStyle w:val="Paragraphedeliste"/>
         <w:numPr>
           <w:ilvl w:val="0"/>
-          <w:numId w:val="1"/>
+          <w:numId w:val="2"/>
         </w:numPr>
         <w:spacing w:after="80"/>
       </w:pPr>
       <w:r>
         <w:t>Scripts de test comparatif et de génération du rapport : scripts/</w:t>
       </w:r>
+    </w:p>
+    <w:p>
+      <w:pPr>
+        <w:pStyle w:val="Titre1"/>
+      </w:pPr>
     </w:p>
     <w:sectPr>
       <w:pgSz w:w="11906" w:h="16838"/>
@@ -4658,6 +5147,92 @@
 <file path=word/numbering.xml><?xml version="1.0" encoding="utf-8"?>
 <w:numbering xmlns:wpc="http://schemas.microsoft.com/office/word/2010/wordprocessingCanvas" xmlns:cx="http://schemas.microsoft.com/office/drawing/2014/chartex" xmlns:cx1="http://schemas.microsoft.com/office/drawing/2015/9/8/chartex" xmlns:cx2="http://schemas.microsoft.com/office/drawing/2015/10/21/chartex" xmlns:cx3="http://schemas.microsoft.com/office/drawing/2016/5/9/chartex" xmlns:cx4="http://schemas.microsoft.com/office/drawing/2016/5/10/chartex" xmlns:cx5="http://schemas.microsoft.com/office/drawing/2016/5/11/chartex" xmlns:cx6="http://schemas.microsoft.com/office/drawing/2016/5/12/chartex" xmlns:cx7="http://schemas.microsoft.com/office/drawing/2016/5/13/chartex" xmlns:cx8="http://schemas.microsoft.com/office/drawing/2016/5/14/chartex" xmlns:mc="http://schemas.openxmlformats.org/markup-compatibility/2006" xmlns:aink="http://schemas.microsoft.com/office/drawing/2016/ink" xmlns:am3d="http://schemas.microsoft.com/office/drawing/2017/model3d" xmlns:o="urn:schemas-microsoft-com:office:office" xmlns:oel="http://schemas.microsoft.com/office/2019/extlst" xmlns:r="http://schemas.openxmlformats.org/officeDocument/2006/relationships" xmlns:m="http://schemas.openxmlformats.org/officeDocument/2006/math" xmlns:v="urn:schemas-microsoft-com:vml" xmlns:wp14="http://schemas.microsoft.com/office/word/2010/wordprocessingDrawing" xmlns:wp="http://schemas.openxmlformats.org/drawingml/2006/wordprocessingDrawing" xmlns:w10="urn:schemas-microsoft-com:office:word" xmlns:w="http://schemas.openxmlformats.org/wordprocessingml/2006/main" xmlns:w14="http://schemas.microsoft.com/office/word/2010/wordml" xmlns:w15="http://schemas.microsoft.com/office/word/2012/wordml" xmlns:w16cex="http://schemas.microsoft.com/office/word/2018/wordml/cex" xmlns:w16cid="http://schemas.microsoft.com/office/word/2016/wordml/cid" xmlns:w16="http://schemas.microsoft.com/office/word/2018/wordml" xmlns:w16du="http://schemas.microsoft.com/office/word/2023/wordml/word16du" xmlns:w16sdtdh="http://schemas.microsoft.com/office/word/2020/wordml/sdtdatahash" xmlns:w16sdtfl="http://schemas.microsoft.com/office/word/2024/wordml/sdtformatlock" xmlns:w16se="http://schemas.microsoft.com/office/word/2015/wordml/symex" xmlns:wpg="http://schemas.microsoft.com/office/word/2010/wordprocessingGroup" xmlns:wpi="http://schemas.microsoft.com/office/word/2010/wordprocessingInk" xmlns:wne="http://schemas.microsoft.com/office/word/2006/wordml" xmlns:wps="http://schemas.microsoft.com/office/word/2010/wordprocessingShape" mc:Ignorable="w14 w15 w16se w16cid w16 w16cex w16sdtdh w16sdtfl w16du wp14">
   <w:abstractNum w:abstractNumId="0" w15:restartNumberingAfterBreak="0">
+    <w:nsid w:val="540B01E1"/>
+    <w:multiLevelType w:val="hybridMultilevel"/>
+    <w:tmpl w:val="92F67638"/>
+    <w:lvl w:ilvl="0" w:tplc="9E6E5E5C">
+      <w:start w:val="1"/>
+      <w:numFmt w:val="bullet"/>
+      <w:lvlText w:val="●"/>
+      <w:lvlJc w:val="left"/>
+      <w:pPr>
+        <w:ind w:left="720" w:hanging="360"/>
+      </w:pPr>
+    </w:lvl>
+    <w:lvl w:ilvl="1" w:tplc="8E68AE68">
+      <w:start w:val="1"/>
+      <w:numFmt w:val="bullet"/>
+      <w:lvlText w:val="○"/>
+      <w:lvlJc w:val="left"/>
+      <w:pPr>
+        <w:ind w:left="1440" w:hanging="360"/>
+      </w:pPr>
+    </w:lvl>
+    <w:lvl w:ilvl="2" w:tplc="640485D6">
+      <w:start w:val="1"/>
+      <w:numFmt w:val="bullet"/>
+      <w:lvlText w:val="■"/>
+      <w:lvlJc w:val="left"/>
+      <w:pPr>
+        <w:ind w:left="2160" w:hanging="360"/>
+      </w:pPr>
+    </w:lvl>
+    <w:lvl w:ilvl="3" w:tplc="D632BC08">
+      <w:start w:val="1"/>
+      <w:numFmt w:val="bullet"/>
+      <w:lvlText w:val="●"/>
+      <w:lvlJc w:val="left"/>
+      <w:pPr>
+        <w:ind w:left="2880" w:hanging="360"/>
+      </w:pPr>
+    </w:lvl>
+    <w:lvl w:ilvl="4" w:tplc="086A1E76">
+      <w:start w:val="1"/>
+      <w:numFmt w:val="bullet"/>
+      <w:lvlText w:val="○"/>
+      <w:lvlJc w:val="left"/>
+      <w:pPr>
+        <w:ind w:left="3600" w:hanging="360"/>
+      </w:pPr>
+    </w:lvl>
+    <w:lvl w:ilvl="5" w:tplc="DB7A9A72">
+      <w:start w:val="1"/>
+      <w:numFmt w:val="bullet"/>
+      <w:lvlText w:val="■"/>
+      <w:lvlJc w:val="left"/>
+      <w:pPr>
+        <w:ind w:left="4320" w:hanging="360"/>
+      </w:pPr>
+    </w:lvl>
+    <w:lvl w:ilvl="6" w:tplc="96AE1724">
+      <w:start w:val="1"/>
+      <w:numFmt w:val="bullet"/>
+      <w:lvlText w:val="●"/>
+      <w:lvlJc w:val="left"/>
+      <w:pPr>
+        <w:ind w:left="5040" w:hanging="360"/>
+      </w:pPr>
+    </w:lvl>
+    <w:lvl w:ilvl="7" w:tplc="1F08D9EE">
+      <w:start w:val="1"/>
+      <w:numFmt w:val="bullet"/>
+      <w:lvlText w:val="●"/>
+      <w:lvlJc w:val="left"/>
+      <w:pPr>
+        <w:ind w:left="5760" w:hanging="360"/>
+      </w:pPr>
+    </w:lvl>
+    <w:lvl w:ilvl="8" w:tplc="3054559A">
+      <w:start w:val="1"/>
+      <w:numFmt w:val="bullet"/>
+      <w:lvlText w:val="●"/>
+      <w:lvlJc w:val="left"/>
+      <w:pPr>
+        <w:ind w:left="6480" w:hanging="360"/>
+      </w:pPr>
+    </w:lvl>
+  </w:abstractNum>
+  <w:abstractNum w:abstractNumId="1" w15:restartNumberingAfterBreak="0">
     <w:nsid w:val="5866126D"/>
     <w:multiLevelType w:val="hybridMultilevel"/>
     <w:tmpl w:val="4D3C6C70"/>
@@ -4744,6 +5319,12 @@
     </w:lvl>
   </w:abstractNum>
   <w:num w:numId="1" w16cid:durableId="118495123">
+    <w:abstractNumId w:val="1"/>
+    <w:lvlOverride w:ilvl="0">
+      <w:startOverride w:val="1"/>
+    </w:lvlOverride>
+  </w:num>
+  <w:num w:numId="2" w16cid:durableId="1005061164">
     <w:abstractNumId w:val="0"/>
     <w:lvlOverride w:ilvl="0">
       <w:startOverride w:val="1"/>
@@ -5149,6 +5730,7 @@
   </w:style>
   <w:style w:type="paragraph" w:styleId="Titre1">
     <w:name w:val="heading 1"/>
+    <w:link w:val="Titre1Car"/>
     <w:uiPriority w:val="9"/>
     <w:qFormat/>
     <w:pPr>
@@ -5241,6 +5823,7 @@
   <w:style w:type="character" w:default="1" w:styleId="Policepardfaut">
     <w:name w:val="Default Paragraph Font"/>
     <w:uiPriority w:val="1"/>
+    <w:semiHidden/>
     <w:unhideWhenUsed/>
   </w:style>
   <w:style w:type="table" w:default="1" w:styleId="TableauNormal">
@@ -5354,6 +5937,20 @@
     <w:rPr>
       <w:sz w:val="20"/>
       <w:szCs w:val="20"/>
+    </w:rPr>
+  </w:style>
+  <w:style w:type="character" w:customStyle="1" w:styleId="Titre1Car">
+    <w:name w:val="Titre 1 Car"/>
+    <w:basedOn w:val="Policepardfaut"/>
+    <w:link w:val="Titre1"/>
+    <w:uiPriority w:val="9"/>
+    <w:rsid w:val="00A077CF"/>
+    <w:rPr>
+      <w:b/>
+      <w:bCs/>
+      <w:color w:val="1F6FB2"/>
+      <w:sz w:val="32"/>
+      <w:szCs w:val="32"/>
     </w:rPr>
   </w:style>
 </w:styles>

</xml_diff>

<commit_message>
Corrections doc finale: retrait Dev IA,  clarification plus-values
</commit_message>
<xml_diff>
--- a/docs/documentation_projet13_bottleneck.docx
+++ b/docs/documentation_projet13_bottleneck.docx
@@ -89,7 +89,7 @@
           <w:sz w:val="20"/>
           <w:szCs w:val="20"/>
         </w:rPr>
-        <w:t xml:space="preserve">Parcours Data </w:t>
+        <w:t>Parcours Data Analyst</w:t>
       </w:r>
       <w:proofErr w:type="spellStart"/>
       <w:r>
@@ -98,7 +98,6 @@
           <w:sz w:val="20"/>
           <w:szCs w:val="20"/>
         </w:rPr>
-        <w:t>Analyst</w:t>
       </w:r>
       <w:proofErr w:type="spellEnd"/>
       <w:r>
@@ -107,7 +106,6 @@
           <w:sz w:val="20"/>
           <w:szCs w:val="20"/>
         </w:rPr>
-        <w:t xml:space="preserve"> / Développeur IA</w:t>
       </w:r>
     </w:p>
     <w:p>
@@ -3453,7 +3451,7 @@
         <w:spacing w:after="160"/>
       </w:pPr>
       <w:r>
-        <w:t>Le notebook complet (117 cellules) a été exécuté intégralement de bout en bout, sans erreur. Cette exécution complète a révélé un bug d'ordre d'exécution préexistant dans le P6 original (une cellule utilisait une colonne calculée dans une cellule postérieure), invisible tant que le notebook n'était exécuté que cellule par cellule dans le désordre. Ce bug a été corrigé, renforçant l'argument de la fiabilité de l'automatisation par rapport à des vérifications manuelles ponctuelles.</w:t>
+        <w:t>Le notebook complet (117 cellules) a été exécuté intégralement de bout en bout, sans erreur, validant la fiabilité de l'ensemble du pipeline avant intégration de l'axe C.</w:t>
       </w:r>
     </w:p>
     <w:p>
@@ -3802,8 +3800,74 @@
         <w:spacing w:after="160"/>
       </w:pPr>
       <w:r>
-        <w:lastRenderedPageBreak/>
-        <w:t>Point notable : l'absence d'anomalies « Majeure » confirme que la correction manuelle de cohérence stock du P6 original fonctionnait correctement — la validation automatisée ne se contente donc pas de détecter des erreurs, elle valide aussi la fiabilité du travail existant. Par ailleurs, 4 cas de vente à perte ont été détectés sans que le prix soit négatif (prix positif mais inférieur au prix d'achat) — invisibles avec le contrôle initial du P6, qui ne vérifiait que le signe du prix.</w:t>
+        <w:t>Point de vigilance méthodologique : les anomalies de prix et de stock négatifs étaient déjà repérées manuellement dans le P6 original (affichées via df_prix_inf_zero et df_stock_inf_zero) — ce n'est donc pas une découverte de l'axe C. Leur correction reste volontairement hors périmètre : il ne revient pas au data analyst de trancher seul, une vérification humaine côté achats est nécessaire (cf. §4.3).</w:t>
+      </w:r>
+    </w:p>
+    <w:p>
+      <w:pPr>
+        <w:spacing w:after="160"/>
+      </w:pPr>
+      <w:r>
+        <w:rPr>
+          <w:b/>
+        </w:rPr>
+        <w:t>Ce qu'apporte réellement l'automatisation :</w:t>
+      </w:r>
+    </w:p>
+    <w:p>
+      <w:pPr>
+        <w:pStyle w:val="Paragraphedeliste"/>
+        <w:numPr>
+          <w:ilvl w:val="0"/>
+          <w:numId w:val="1"/>
+        </w:numPr>
+        <w:spacing w:after="80"/>
+      </w:pPr>
+      <w:r>
+        <w:rPr/>
+        <w:t>Automatisation et reproductibilité — les vérifications existaient déjà mais étaient dispersées dans des cellules ad hoc du notebook ; Pandera les formalise en un schéma unique, rejouable à chaque nouvel import sans réécrire de code.</w:t>
+      </w:r>
+    </w:p>
+    <w:p>
+      <w:pPr>
+        <w:pStyle w:val="Paragraphedeliste"/>
+        <w:numPr>
+          <w:ilvl w:val="0"/>
+          <w:numId w:val="1"/>
+        </w:numPr>
+        <w:spacing w:after="80"/>
+      </w:pPr>
+      <w:r>
+        <w:rPr/>
+        <w:t>Un livrable exploitable — avant, les anomalies étaient seulement affichées dans un notebook Python ; désormais, un rapport Excel priorisé permet au service achats d'agir sans ouvrir de code. C'est un saut de valeur métier, même sur des anomalies déjà repérées.</w:t>
+      </w:r>
+    </w:p>
+    <w:p>
+      <w:pPr>
+        <w:pStyle w:val="Paragraphedeliste"/>
+        <w:numPr>
+          <w:ilvl w:val="0"/>
+          <w:numId w:val="1"/>
+        </w:numPr>
+        <w:spacing w:after="80"/>
+      </w:pPr>
+      <w:r>
+        <w:rPr/>
+        <w:t>Une découverte inédite — les 4 cas de vente à perte (prix positif mais inférieur au prix d'achat) étaient invisibles avec le contrôle initial du P6, qui ne vérifiait que le signe du prix.</w:t>
+      </w:r>
+    </w:p>
+    <w:p>
+      <w:pPr>
+        <w:pStyle w:val="Paragraphedeliste"/>
+        <w:numPr>
+          <w:ilvl w:val="0"/>
+          <w:numId w:val="1"/>
+        </w:numPr>
+        <w:spacing w:after="80"/>
+      </w:pPr>
+      <w:r>
+        <w:rPr/>
+        <w:t>Une confirmation du travail existant — l'absence d'anomalie « Majeure » valide que la correction manuelle de cohérence stock du P6 original fonctionnait déjà correctement : l'automatisation ne fait pas que détecter des erreurs, elle valide aussi la fiabilité de l'existant.</w:t>
       </w:r>
     </w:p>
     <w:p>

</xml_diff>